<commit_message>
Clarifier le rapport du TP RSA et les commentaires avec des exemples simples
</commit_message>
<xml_diff>
--- a/TP_secu_1/docs/Walter_Arthur_compte_rendu.docx
+++ b/TP_secu_1/docs/Walter_Arthur_compte_rendu.docx
@@ -38,12 +38,12 @@
     </w:p>
     <w:p>
       <w:r>
-        <w:t>La fonction home_mod_expnoent(x, y, n) calcule x puissance y modulo n par carrés et multiplications. L’exposant est parcouru en binaire, du bit de poids faible vers le bit de poids fort. Lorsqu’un bit vaut 1, la puissance courante est multipliée au résultat. La base est ensuite élevée au carré et l’exposant divisé par deux.</w:t>
+        <w:t>La fonction home_mod_expnoent(x, y, n) calcule x puissance y modulo n. Elle évite de construire toute la puissance : elle utilise des carrés successifs et ne multiplie au résultat que les puissances nécessaires. Pour cela, l’exposant est lu en binaire, de droite à gauche.</w:t>
       </w:r>
     </w:p>
     <w:p>
       <w:r>
-        <w:t>Le modulo est appliqué après chaque multiplication pour éviter de construire la puissance entière. Le nombre de tours correspond à la longueur de l’exposant en bits. Le nom de la fonction a été conservé tel qu’il figure dans le squelette.</w:t>
+        <w:t>À chaque multiplication, on ne garde que le reste de la division par n. Par exemple, 17 modulo 5 vaut 2, puisque 17 = 3 × 5 + 2. De même, 2 puissance 3 modulo 5 donne 3 : on calcule 8, puis son reste dans la division par 5. Le nombre de tours de la boucle correspond à la longueur de l’exposant en bits.</w:t>
       </w:r>
     </w:p>
     <w:p>
@@ -61,7 +61,7 @@
     </w:p>
     <w:p>
       <w:r>
-        <w:t>home_ext_euclide(y, b) renvoie l’inverse de b modulo y. L’ordre des arguments reste celui du fichier fourni : le module en premier, puis l’exposant public. Le calcul de la clé privée d’Alice est donc home_ext_euclide(lambda_a, ea).</w:t>
+        <w:t>home_ext_euclide(y, b) cherche le nombre qui, multiplié par b, donne un reste de 1 modulo y. C’est ce que l’on appelle un inverse modulaire. Le module vient en premier dans l’appel ; le calcul de la clé privée d’Alice est donc home_ext_euclide(lambda_a, ea).</w:t>
       </w:r>
     </w:p>
     <w:p>
@@ -90,7 +90,7 @@
     </w:p>
     <w:p>
       <w:r>
-        <w:t>La vérification sur l’exemple classique donne l’inverse 2753 pour 17 modulo 3120 :</w:t>
+        <w:t>Avec le module 20 et le nombre 3, l’inverse vaut 7 : 3 × 7 = 21, qui laisse un reste de 1 modulo 20. La même méthode donne 2753 comme inverse de 17 modulo 3120 :</w:t>
       </w:r>
     </w:p>
     <w:p>
@@ -128,12 +128,12 @@
     </w:p>
     <w:p>
       <w:r>
-        <w:t>Bob convertit le message en octets UTF-8, puis en entier big-endian. Il chiffre cet entier avec la clé publique d’Alice, formée de na et ea. Alice applique l’exponentiation avec da pour retrouver le message.</w:t>
+        <w:t>Bob commence par représenter son texte avec un nombre. Le texte passe en octets UTF-8, puis en entier big-endian. Il chiffre cet entier avec la clé publique d’Alice, formée de na et ea. Alice utilise ensuite da, sa clé privée, pour retrouver l’entier et reconstruire le texte.</w:t>
       </w:r>
     </w:p>
     <w:p>
       <w:r>
-        <w:t>La signature utilise l’autre paire de clés. Bob calcule l’empreinte du texte et la signe avec db. Alice recalcule l’empreinte du message déchiffré et vérifie la signature avec eb et nb. Cette vérification suppose que la clé publique attribuée à Bob soit fiable.</w:t>
+        <w:t>Pour la signature, ce sont les clés de Bob qui interviennent. Bob signe l’empreinte du texte avec db. Alice recalcule l’empreinte du message qu’elle a retrouvé et vérifie les signatures avec eb et nb. Le chiffrement sert donc à réserver la lecture à Alice ; la signature permet de vérifier le contenu avec la clé de Bob, à condition de disposer de sa véritable clé publique.</w:t>
       </w:r>
     </w:p>
     <w:tbl>
@@ -482,7 +482,7 @@
     </w:p>
     <w:p>
       <w:r>
-        <w:t>La longueur en octets est conservée dans l’envoi pour restituer les éventuels zéros initiaux. Les conversions du squelette ont été remplacées ensemble pour traiter les accents correctement. Les valeurs du chiffré et des signatures sont conservées dans resultats/execution_complete.json.</w:t>
+        <w:t>La longueur en octets accompagne l’envoi pour ne pas perdre les éventuels zéros au début. Les deux conversions ont été modifiées ensemble pour conserver aussi les accents. Le détail des valeurs calculées se trouve dans resultats/execution_complete.json.</w:t>
       </w:r>
     </w:p>
     <w:p>
@@ -549,7 +549,7 @@
     </w:p>
     <w:p>
       <w:r>
-        <w:t>home_mod_expnoent_trace reprend l’exponentiation de la première partie. Elle compte les multiplications effectuées lorsque le bit courant de l’exposant vaut 1 et enregistre la suite des bits parcourus. Les carrés sont comptés séparément.</w:t>
+        <w:t>home_mod_expnoent_trace fait le même calcul qu’en partie 1, mais garde une trace des opérations. Chaque bit à 1 entraîne une multiplication supplémentaire. La fonction compte ces multiplications et note l’ordre des bits rencontrés ; elle compte les carrés à part.</w:t>
       </w:r>
     </w:p>
     <w:p>
@@ -564,7 +564,7 @@
     </w:p>
     <w:p>
       <w:r>
-        <w:t>Si les pics d’activité sont observés avec assez de précision pour distinguer les opérations de chaque tour, leur position peut révéler les bits de la clé dans ce modèle. Ici, les événements sont enregistrés dans le programme ; aucune mesure physique de consommation ou de cache n’a été effectuée.</w:t>
+        <w:t>Un observateur qui distingue les opérations de chaque tour peut en déduire davantage que ce simple total : la position des multiplications peut révéler les bits de l’exposant. Dans le TP, ces événements sont notés directement par le programme. Ils représentent ce que l’on pourrait chercher à observer ; aucune mesure physique de consommation ou de cache n’a été réalisée.</w:t>
       </w:r>
     </w:p>
     <w:p>
@@ -1109,7 +1109,7 @@
     </w:p>
     <w:p>
       <w:r>
-        <w:t>Le déchiffrement est réparti entre les deux facteurs premiers du module. Les paramètres sont calculés une seule fois, puis réutilisés :</w:t>
+        <w:t>Au lieu de faire tout le déchiffrement modulo n, on fait deux calculs, l’un modulo p et l’autre modulo q. Ces nombres sont plus petits. Les exposants réduits sont préparés une fois, puis réutilisés :</w:t>
       </w:r>
     </w:p>
     <w:p>
@@ -1141,7 +1141,7 @@
     </w:p>
     <w:p>
       <w:r>
-        <w:t>Les deux exponentiations donnent mp modulo p et mq modulo q. La recombinaison est celle du document fourni :</w:t>
+        <w:t>Les résultats mp et mq ne sont pas deux morceaux du texte. Ce sont deux restes du même message : l’un modulo p, l’autre modulo q. Le CRT permet de retrouver le seul entier entre 0 et n − 1 qui respecte ces deux restes :</w:t>
       </w:r>
     </w:p>
     <w:p>
@@ -1174,7 +1174,7 @@
     </w:p>
     <w:p>
       <w:r>
-        <w:t>Dans l’exemple du professeur, p = 137, q = 131, c = 8363 et d = 11787. Le programme obtient dp = 91, dq = 87 et q_inv = 114. Les résultats intermédiaires sont mp = 102 et mq = 120.</w:t>
+        <w:t>Dans l’exemple du TP, p = 137, q = 131, c = 8363 et d = 11787. Le programme obtient dp = 91, dq = 87 et q_inv = 114. Les résultats intermédiaires sont mp = 102 et mq = 120.</w:t>
       </w:r>
     </w:p>
     <w:p>
@@ -1664,7 +1664,7 @@
     </w:p>
     <w:p>
       <w:r>
-        <w:t>Le programme vérifie le préfixe, le séparateur et les tailles, puis retire le bourrage. Les morceaux sont réunis avant le décodage UTF-8, ce qui préserve un caractère coupé entre deux blocs. La signature est vérifiée sur le message complet restitué.</w:t>
+        <w:t>Alice vérifie le préfixe, le séparateur et les tailles, puis enlève le bourrage. Elle réunit d’abord les octets et les décode seulement après, car un caractère UTF-8 peut être coupé entre deux blocs. La signature est vérifiée sur le texte complet retrouvé.</w:t>
       </w:r>
     </w:p>
     <w:p>
@@ -2186,6 +2186,314 @@
         <w:pStyle w:val="Heading1"/>
       </w:pPr>
       <w:r>
+        <w:t>Vérifications avec de petits exemples</w:t>
+      </w:r>
+    </w:p>
+    <w:p>
+      <w:r>
+        <w:t>Les exemples ci-dessous utilisent les mêmes fonctions que le TP. Les petites valeurs servent uniquement à suivre les opérations à la main. Les résultats sont aussi enregistrés dans resultats/exemples_simples.json.</w:t>
+      </w:r>
+    </w:p>
+    <w:p>
+      <w:pPr>
+        <w:pStyle w:val="Heading2"/>
+      </w:pPr>
+      <w:r>
+        <w:t>Retrouver un message avec de petites clés</w:t>
+      </w:r>
+    </w:p>
+    <w:p>
+      <w:r>
+        <w:t>On prend p = 11 et q = 5, donc n = 55 et λ(n) = 20. On choisit e = 3 et d = 7 : ces exposants vont ensemble, car 3 × 7 laisse un reste de 1 modulo 20. Pour ce seul exemple, le message est directement l’entier 8, sans texte ni bourrage.</w:t>
+      </w:r>
+    </w:p>
+    <w:p>
+      <m:oMath>
+        <m:r>
+          <m:t>Chiffrement : 8³ mod 55 = 17</m:t>
+        </m:r>
+      </m:oMath>
+    </w:p>
+    <w:p>
+      <m:oMath>
+        <m:r>
+          <m:t>Déchiffrement : 17⁷ mod 55 = 8</m:t>
+        </m:r>
+      </m:oMath>
+    </w:p>
+    <w:p>
+      <w:r>
+        <w:t>On retrouve donc bien 8. Dans le programme principal, le principe est le même, mais le texte est d’abord converti en entier et les clés sont celles de l’énoncé.</w:t>
+      </w:r>
+    </w:p>
+    <w:p>
+      <w:pPr>
+        <w:pStyle w:val="Heading2"/>
+      </w:pPr>
+      <w:r>
+        <w:t>Vérifier le même calcul avec le CRT</w:t>
+      </w:r>
+    </w:p>
+    <w:p>
+      <w:r>
+        <w:t>Pour ce chiffré 17, on trouve dp = 7, dq = 3 et q_inv = 9. Les deux calculs donnent mp = 8 et mq = 3. La recombinaison donne h = 1, puis m = 3 + 1 × 5 = 8. Le calcul direct et le CRT arrivent bien au même résultat.</w:t>
+      </w:r>
+    </w:p>
+    <w:p>
+      <w:pPr>
+        <w:pStyle w:val="Heading2"/>
+      </w:pPr>
+      <w:r>
+        <w:t>Changer une seule lettre dans le message</w:t>
+      </w:r>
+    </w:p>
+    <w:p>
+      <w:r>
+        <w:t>Les textes Bonjour et bonjour ne diffèrent que par la majuscule. Leurs empreintes SHA-256 sont pourtant différentes. Voici leurs seize premiers caractères hexadécimaux ; les empreintes complètes restent de 32 octets.</w:t>
+      </w:r>
+    </w:p>
+    <w:tbl>
+      <w:tblPr>
+        <w:tblW w:type="auto" w:w="0"/>
+        <w:tblLayout w:type="fixed"/>
+        <w:tblLook w:firstColumn="1" w:firstRow="1" w:lastColumn="0" w:lastRow="0" w:noHBand="0" w:noVBand="1" w:val="04A0"/>
+      </w:tblPr>
+      <w:tblGrid>
+        <w:gridCol w:w="2880"/>
+        <w:gridCol w:w="7056"/>
+      </w:tblGrid>
+      <w:tr>
+        <w:trPr>
+          <w:cantSplit/>
+          <w:tblHeader/>
+        </w:trPr>
+        <w:tc>
+          <w:tcPr>
+            <w:tcW w:type="dxa" w:w="2880"/>
+            <w:tcBorders>
+              <w:top w:val="single" w:sz="4" w:color="D9D9D9"/>
+              <w:left w:val="single" w:sz="4" w:color="D9D9D9"/>
+              <w:bottom w:val="single" w:sz="4" w:color="D9D9D9"/>
+              <w:right w:val="single" w:sz="4" w:color="D9D9D9"/>
+            </w:tcBorders>
+            <w:tcMar>
+              <w:top w:w="80" w:type="dxa"/>
+              <w:left w:w="80" w:type="dxa"/>
+              <w:bottom w:w="80" w:type="dxa"/>
+              <w:right w:w="80" w:type="dxa"/>
+            </w:tcMar>
+            <w:vAlign w:val="center"/>
+            <w:shd w:fill="E8EDF2"/>
+          </w:tcPr>
+          <w:p>
+            <w:pPr>
+              <w:spacing w:after="40"/>
+            </w:pPr>
+            <w:r>
+              <w:rPr>
+                <w:b/>
+                <w:sz w:val="20"/>
+              </w:rPr>
+              <w:t>Texte</w:t>
+            </w:r>
+          </w:p>
+        </w:tc>
+        <w:tc>
+          <w:tcPr>
+            <w:tcW w:type="dxa" w:w="7056"/>
+            <w:tcBorders>
+              <w:top w:val="single" w:sz="4" w:color="D9D9D9"/>
+              <w:left w:val="single" w:sz="4" w:color="D9D9D9"/>
+              <w:bottom w:val="single" w:sz="4" w:color="D9D9D9"/>
+              <w:right w:val="single" w:sz="4" w:color="D9D9D9"/>
+            </w:tcBorders>
+            <w:tcMar>
+              <w:top w:w="80" w:type="dxa"/>
+              <w:left w:w="80" w:type="dxa"/>
+              <w:bottom w:w="80" w:type="dxa"/>
+              <w:right w:w="80" w:type="dxa"/>
+            </w:tcMar>
+            <w:vAlign w:val="center"/>
+            <w:shd w:fill="E8EDF2"/>
+          </w:tcPr>
+          <w:p>
+            <w:pPr>
+              <w:spacing w:after="40"/>
+            </w:pPr>
+            <w:r>
+              <w:rPr>
+                <w:b/>
+                <w:sz w:val="20"/>
+              </w:rPr>
+              <w:t>Début du SHA-256</w:t>
+            </w:r>
+          </w:p>
+        </w:tc>
+      </w:tr>
+      <w:tr>
+        <w:trPr>
+          <w:cantSplit/>
+        </w:trPr>
+        <w:tc>
+          <w:tcPr>
+            <w:tcW w:type="dxa" w:w="2880"/>
+            <w:tcBorders>
+              <w:top w:val="single" w:sz="4" w:color="D9D9D9"/>
+              <w:left w:val="single" w:sz="4" w:color="D9D9D9"/>
+              <w:bottom w:val="single" w:sz="4" w:color="D9D9D9"/>
+              <w:right w:val="single" w:sz="4" w:color="D9D9D9"/>
+            </w:tcBorders>
+            <w:tcMar>
+              <w:top w:w="80" w:type="dxa"/>
+              <w:left w:w="80" w:type="dxa"/>
+              <w:bottom w:w="80" w:type="dxa"/>
+              <w:right w:w="80" w:type="dxa"/>
+            </w:tcMar>
+            <w:vAlign w:val="center"/>
+          </w:tcPr>
+          <w:p>
+            <w:pPr>
+              <w:spacing w:after="40"/>
+            </w:pPr>
+            <w:r>
+              <w:rPr>
+                <w:b w:val="0"/>
+                <w:sz w:val="20"/>
+              </w:rPr>
+              <w:t>Bonjour</w:t>
+            </w:r>
+          </w:p>
+        </w:tc>
+        <w:tc>
+          <w:tcPr>
+            <w:tcW w:type="dxa" w:w="7056"/>
+            <w:tcBorders>
+              <w:top w:val="single" w:sz="4" w:color="D9D9D9"/>
+              <w:left w:val="single" w:sz="4" w:color="D9D9D9"/>
+              <w:bottom w:val="single" w:sz="4" w:color="D9D9D9"/>
+              <w:right w:val="single" w:sz="4" w:color="D9D9D9"/>
+            </w:tcBorders>
+            <w:tcMar>
+              <w:top w:w="80" w:type="dxa"/>
+              <w:left w:w="80" w:type="dxa"/>
+              <w:bottom w:w="80" w:type="dxa"/>
+              <w:right w:w="80" w:type="dxa"/>
+            </w:tcMar>
+            <w:vAlign w:val="center"/>
+          </w:tcPr>
+          <w:p>
+            <w:pPr>
+              <w:spacing w:after="40"/>
+            </w:pPr>
+            <w:r>
+              <w:rPr>
+                <w:b w:val="0"/>
+                <w:sz w:val="20"/>
+              </w:rPr>
+              <w:t>9172e8eec99f144f</w:t>
+            </w:r>
+          </w:p>
+        </w:tc>
+      </w:tr>
+      <w:tr>
+        <w:trPr>
+          <w:cantSplit/>
+        </w:trPr>
+        <w:tc>
+          <w:tcPr>
+            <w:tcW w:type="dxa" w:w="2880"/>
+            <w:tcBorders>
+              <w:top w:val="single" w:sz="4" w:color="D9D9D9"/>
+              <w:left w:val="single" w:sz="4" w:color="D9D9D9"/>
+              <w:bottom w:val="single" w:sz="4" w:color="D9D9D9"/>
+              <w:right w:val="single" w:sz="4" w:color="D9D9D9"/>
+            </w:tcBorders>
+            <w:tcMar>
+              <w:top w:w="80" w:type="dxa"/>
+              <w:left w:w="80" w:type="dxa"/>
+              <w:bottom w:w="80" w:type="dxa"/>
+              <w:right w:w="80" w:type="dxa"/>
+            </w:tcMar>
+            <w:vAlign w:val="center"/>
+          </w:tcPr>
+          <w:p>
+            <w:pPr>
+              <w:spacing w:after="40"/>
+            </w:pPr>
+            <w:r>
+              <w:rPr>
+                <w:b w:val="0"/>
+                <w:sz w:val="20"/>
+              </w:rPr>
+              <w:t>bonjour</w:t>
+            </w:r>
+          </w:p>
+        </w:tc>
+        <w:tc>
+          <w:tcPr>
+            <w:tcW w:type="dxa" w:w="7056"/>
+            <w:tcBorders>
+              <w:top w:val="single" w:sz="4" w:color="D9D9D9"/>
+              <w:left w:val="single" w:sz="4" w:color="D9D9D9"/>
+              <w:bottom w:val="single" w:sz="4" w:color="D9D9D9"/>
+              <w:right w:val="single" w:sz="4" w:color="D9D9D9"/>
+            </w:tcBorders>
+            <w:tcMar>
+              <w:top w:w="80" w:type="dxa"/>
+              <w:left w:w="80" w:type="dxa"/>
+              <w:bottom w:w="80" w:type="dxa"/>
+              <w:right w:w="80" w:type="dxa"/>
+            </w:tcMar>
+            <w:vAlign w:val="center"/>
+          </w:tcPr>
+          <w:p>
+            <w:pPr>
+              <w:spacing w:after="40"/>
+            </w:pPr>
+            <w:r>
+              <w:rPr>
+                <w:b w:val="0"/>
+                <w:sz w:val="20"/>
+              </w:rPr>
+              <w:t>2cb4b1431b84ec15</w:t>
+            </w:r>
+          </w:p>
+        </w:tc>
+      </w:tr>
+    </w:tbl>
+    <w:p>
+      <w:pPr>
+        <w:spacing w:after="0"/>
+      </w:pPr>
+    </w:p>
+    <w:p>
+      <w:pPr>
+        <w:pStyle w:val="Heading2"/>
+      </w:pPr>
+      <w:r>
+        <w:t>Vérifier le découpage en blocs</w:t>
+      </w:r>
+    </w:p>
+    <w:p>
+      <w:r>
+        <w:t>Les 26 lettres ABCDEFGHIJKLMNOPQRSTUVWXYZ occupent 26 octets en UTF-8. Avec 13 octets par morceau, on obtient deux blocs : ABCDEFGHIJKLM puis NOPQRSTUVWXYZ. Après déchiffrement et retrait du bourrage, leur réunion restitue l’alphabet complet.</w:t>
+      </w:r>
+    </w:p>
+    <w:p>
+      <w:r>
+        <w:t>Un accent illustre pourquoi le décodage attend la fin : douze lettres A suivies de é occupent 14 octets. Les deux octets de é, C3 et A9 en hexadécimal, se retrouvent de part et d’autre de la coupure à 13 octets. Réunir les octets avant de décoder permet de retrouver la lettre.</w:t>
+      </w:r>
+    </w:p>
+    <w:p>
+      <w:r>
+        <w:br w:type="page"/>
+      </w:r>
+    </w:p>
+    <w:p>
+      <w:pPr>
+        <w:pStyle w:val="Heading1"/>
+      </w:pPr>
+      <w:r>
         <w:t>Exécution et vérifications</w:t>
       </w:r>
     </w:p>

</xml_diff>

<commit_message>
Retirer les références finales du compte rendu RSA
</commit_message>
<xml_diff>
--- a/TP_secu_1/docs/Walter_Arthur_compte_rendu.docx
+++ b/TP_secu_1/docs/Walter_Arthur_compte_rendu.docx
@@ -2566,29 +2566,6 @@
         <w:t>Les résultats du TP sont conservés dans execution_complete.json et message_long.json. Les tests vérifient le comportement du programme, sans établir la sécurité de l’échange. Les clés restent petites, la signature SHA-256 en deux blocs est non standard et les calculs Python ne sont pas à temps constant. Le remplacement de MD5 et l’ajout du bourrage ne suffisent pas à rendre cette construction adaptée à un usage réel.</w:t>
       </w:r>
     </w:p>
-    <w:p>
-      <w:pPr>
-        <w:pStyle w:val="Heading2"/>
-      </w:pPr>
-      <w:r>
-        <w:t>Références</w:t>
-      </w:r>
-    </w:p>
-    <w:p>
-      <w:r>
-        <w:t>Abdeljalil ABBAS-TURKI, TP_RSA_Enonce.pdf, partie 1 page 2, parties 2 et 3 pages 2 et 3 ; Exp_CRT_RSA.pdf, pages 1 et 2 ; squelette RSA_B_A.py. Les trois fichiers sont conservés dans TP_secu_1/sources.</w:t>
-      </w:r>
-    </w:p>
-    <w:p>
-      <w:r>
-        <w:t>RFC 8017, sections 7.2 et 8.2 : https://www.rfc-editor.org/rfc/rfc8017.html. RFC 8446, TLS 1.3 : https://www.rfc-editor.org/rfc/rfc8446.html.</w:t>
-      </w:r>
-    </w:p>
-    <w:p>
-      <w:r>
-        <w:t>Relevé du certificat du 16 octobre 2026 : https://github.com/zeylon-labs/master2-TP/actions/runs/38928738912.</w:t>
-      </w:r>
-    </w:p>
     <w:sectPr>
       <w:footerReference w:type="default" r:id="rId9"/>
       <w:pgSz w:w="12240" w:h="15840"/>

</xml_diff>